<commit_message>
Remove author names from LICENSE and project report
</commit_message>
<xml_diff>
--- a/docs/SOCGPT_Project_Report.docx
+++ b/docs/SOCGPT_Project_Report.docx
@@ -203,7 +203,7 @@
           <w:sz w:val="24"/>
           <w:szCs w:val="24"/>
         </w:rPr>
-        <w:t>SRINANDHINI P</w:t>
+        <w:t>Student 1</w:t>
       </w:r>
       <w:r>
         <w:rPr>
@@ -233,7 +233,7 @@
           <w:sz w:val="24"/>
           <w:szCs w:val="24"/>
         </w:rPr>
-        <w:t>CH.SC.U4CYS25036</w:t>
+        <w:t>XXXXXXXXX</w:t>
       </w:r>
     </w:p>
     <w:p>
@@ -256,7 +256,7 @@
           <w:sz w:val="24"/>
           <w:szCs w:val="24"/>
         </w:rPr>
-        <w:t>MAGITA</w:t>
+        <w:t>Student 2</w:t>
       </w:r>
       <w:r>
         <w:rPr>
@@ -270,7 +270,7 @@
           <w:sz w:val="24"/>
           <w:szCs w:val="24"/>
         </w:rPr>
-        <w:t xml:space="preserve"> CH.SC.U4CYS25015</w:t>
+        <w:t xml:space="preserve"> XXXXXXXXX</w:t>
       </w:r>
     </w:p>
     <w:p>

</xml_diff>